<commit_message>
New title + Piazzesi-format submission PDF; static TOC fix in docx builder
- Title: 'More Strategies, Same Zero: Multiple Testing Against LLM-Scale Alpha Search'
- build_piazzesi_pdf.py: PAPER.md -> NBER/Piazzesi-style PDF (Chrome render, stamped page numbers)
- build_docx.js: replace auto-TOC field (blank in Google Docs, duplicated in Pages) with static TOC

Co-Authored-By: Claude Opus 4.8 <noreply@anthropic.com>
</commit_message>
<xml_diff>
--- a/papers/false-alpha/PAPER.docx
+++ b/papers/false-alpha/PAPER.docx
@@ -107,13 +107,9 @@
       </w:r>
     </w:p>
     <w:p>
-      <w:r>
-        <w:br w:type="page"/>
-      </w:r>
-    </w:p>
-    <w:p>
       <w:pPr>
         <w:pStyle w:val="Heading1"/>
+        <w:pageBreakBefore/>
       </w:pPr>
       <w:r>
         <w:rPr>
@@ -127,32 +123,915 @@
         <w:t xml:space="preserve">Contents</w:t>
       </w:r>
     </w:p>
-    <w:sdt>
-      <w:sdtPr>
-        <w:alias w:val="Contents"/>
-      </w:sdtPr>
-      <w:sdtContent>
-        <w:p>
-          <w:r>
-            <w:fldChar w:fldCharType="begin" w:dirty="true"/>
-            <w:instrText xml:space="preserve">TOC \o "1-2"</w:instrText>
-            <w:fldChar w:fldCharType="separate"/>
-          </w:r>
-        </w:p>
-        <w:p>
-          <w:r>
-            <w:fldChar w:fldCharType="end"/>
-          </w:r>
-        </w:p>
-      </w:sdtContent>
-    </w:sdt>
-    <w:p>
-      <w:r>
-        <w:br w:type="page"/>
-      </w:r>
-    </w:p>
-    <w:p>
-      <w:pPr>
+    <w:p>
+      <w:pPr>
+        <w:tabs>
+          <w:tab w:val="right" w:pos="9360" w:leader="dot"/>
+        </w:tabs>
+        <w:spacing w:after="20" w:line="300" w:lineRule="exact"/>
+      </w:pPr>
+      <w:r>
+        <w:rPr>
+          <w:rFonts w:ascii="Cambria" w:cs="Cambria" w:eastAsia="Cambria" w:hAnsi="Cambria"/>
+          <w:b/>
+          <w:bCs/>
+          <w:color w:val="000000"/>
+          <w:sz w:val="21"/>
+          <w:szCs w:val="21"/>
+        </w:rPr>
+        <w:t xml:space="preserve">Abstract</w:t>
+      </w:r>
+      <w:r>
+        <w:rPr>
+          <w:rFonts w:ascii="Cambria" w:cs="Cambria" w:eastAsia="Cambria" w:hAnsi="Cambria"/>
+          <w:color w:val="000000"/>
+          <w:sz w:val="21"/>
+          <w:szCs w:val="21"/>
+        </w:rPr>
+        <w:tab/>
+      </w:r>
+      <w:r>
+        <w:rPr>
+          <w:rFonts w:ascii="Cambria" w:cs="Cambria" w:eastAsia="Cambria" w:hAnsi="Cambria"/>
+          <w:b/>
+          <w:bCs/>
+          <w:color w:val="000000"/>
+          <w:sz w:val="21"/>
+          <w:szCs w:val="21"/>
+        </w:rPr>
+        <w:t xml:space="preserve">3</w:t>
+      </w:r>
+    </w:p>
+    <w:p>
+      <w:pPr>
+        <w:tabs>
+          <w:tab w:val="right" w:pos="9360" w:leader="dot"/>
+        </w:tabs>
+        <w:spacing w:after="20" w:line="300" w:lineRule="exact"/>
+      </w:pPr>
+      <w:r>
+        <w:rPr>
+          <w:rFonts w:ascii="Cambria" w:cs="Cambria" w:eastAsia="Cambria" w:hAnsi="Cambria"/>
+          <w:b/>
+          <w:bCs/>
+          <w:color w:val="000000"/>
+          <w:sz w:val="21"/>
+          <w:szCs w:val="21"/>
+        </w:rPr>
+        <w:t xml:space="preserve">1. Introduction and research question</w:t>
+      </w:r>
+      <w:r>
+        <w:rPr>
+          <w:rFonts w:ascii="Cambria" w:cs="Cambria" w:eastAsia="Cambria" w:hAnsi="Cambria"/>
+          <w:color w:val="000000"/>
+          <w:sz w:val="21"/>
+          <w:szCs w:val="21"/>
+        </w:rPr>
+        <w:tab/>
+      </w:r>
+      <w:r>
+        <w:rPr>
+          <w:rFonts w:ascii="Cambria" w:cs="Cambria" w:eastAsia="Cambria" w:hAnsi="Cambria"/>
+          <w:b/>
+          <w:bCs/>
+          <w:color w:val="000000"/>
+          <w:sz w:val="21"/>
+          <w:szCs w:val="21"/>
+        </w:rPr>
+        <w:t xml:space="preserve">4</w:t>
+      </w:r>
+    </w:p>
+    <w:p>
+      <w:pPr>
+        <w:tabs>
+          <w:tab w:val="right" w:pos="9360" w:leader="dot"/>
+        </w:tabs>
+        <w:spacing w:after="20" w:line="300" w:lineRule="exact"/>
+      </w:pPr>
+      <w:r>
+        <w:rPr>
+          <w:rFonts w:ascii="Cambria" w:cs="Cambria" w:eastAsia="Cambria" w:hAnsi="Cambria"/>
+          <w:b/>
+          <w:bCs/>
+          <w:color w:val="000000"/>
+          <w:sz w:val="21"/>
+          <w:szCs w:val="21"/>
+        </w:rPr>
+        <w:t xml:space="preserve">2. The engine and the gate</w:t>
+      </w:r>
+      <w:r>
+        <w:rPr>
+          <w:rFonts w:ascii="Cambria" w:cs="Cambria" w:eastAsia="Cambria" w:hAnsi="Cambria"/>
+          <w:color w:val="000000"/>
+          <w:sz w:val="21"/>
+          <w:szCs w:val="21"/>
+        </w:rPr>
+        <w:tab/>
+      </w:r>
+      <w:r>
+        <w:rPr>
+          <w:rFonts w:ascii="Cambria" w:cs="Cambria" w:eastAsia="Cambria" w:hAnsi="Cambria"/>
+          <w:b/>
+          <w:bCs/>
+          <w:color w:val="000000"/>
+          <w:sz w:val="21"/>
+          <w:szCs w:val="21"/>
+        </w:rPr>
+        <w:t xml:space="preserve">6</w:t>
+      </w:r>
+    </w:p>
+    <w:p>
+      <w:pPr>
+        <w:tabs>
+          <w:tab w:val="right" w:pos="9360" w:leader="dot"/>
+        </w:tabs>
+        <w:spacing w:after="20" w:line="300" w:lineRule="exact"/>
+      </w:pPr>
+      <w:r>
+        <w:rPr>
+          <w:rFonts w:ascii="Cambria" w:cs="Cambria" w:eastAsia="Cambria" w:hAnsi="Cambria"/>
+          <w:b/>
+          <w:bCs/>
+          <w:color w:val="000000"/>
+          <w:sz w:val="21"/>
+          <w:szCs w:val="21"/>
+        </w:rPr>
+        <w:t xml:space="preserve">3. Method: the N-sweep</w:t>
+      </w:r>
+      <w:r>
+        <w:rPr>
+          <w:rFonts w:ascii="Cambria" w:cs="Cambria" w:eastAsia="Cambria" w:hAnsi="Cambria"/>
+          <w:color w:val="000000"/>
+          <w:sz w:val="21"/>
+          <w:szCs w:val="21"/>
+        </w:rPr>
+        <w:tab/>
+      </w:r>
+      <w:r>
+        <w:rPr>
+          <w:rFonts w:ascii="Cambria" w:cs="Cambria" w:eastAsia="Cambria" w:hAnsi="Cambria"/>
+          <w:b/>
+          <w:bCs/>
+          <w:color w:val="000000"/>
+          <w:sz w:val="21"/>
+          <w:szCs w:val="21"/>
+        </w:rPr>
+        <w:t xml:space="preserve">7</w:t>
+      </w:r>
+    </w:p>
+    <w:p>
+      <w:pPr>
+        <w:tabs>
+          <w:tab w:val="right" w:pos="9360" w:leader="dot"/>
+        </w:tabs>
+        <w:spacing w:after="20" w:line="300" w:lineRule="exact"/>
+      </w:pPr>
+      <w:r>
+        <w:rPr>
+          <w:rFonts w:ascii="Cambria" w:cs="Cambria" w:eastAsia="Cambria" w:hAnsi="Cambria"/>
+          <w:b/>
+          <w:bCs/>
+          <w:color w:val="000000"/>
+          <w:sz w:val="21"/>
+          <w:szCs w:val="21"/>
+        </w:rPr>
+        <w:t xml:space="preserve">4. Results</w:t>
+      </w:r>
+      <w:r>
+        <w:rPr>
+          <w:rFonts w:ascii="Cambria" w:cs="Cambria" w:eastAsia="Cambria" w:hAnsi="Cambria"/>
+          <w:color w:val="000000"/>
+          <w:sz w:val="21"/>
+          <w:szCs w:val="21"/>
+        </w:rPr>
+        <w:tab/>
+      </w:r>
+      <w:r>
+        <w:rPr>
+          <w:rFonts w:ascii="Cambria" w:cs="Cambria" w:eastAsia="Cambria" w:hAnsi="Cambria"/>
+          <w:b/>
+          <w:bCs/>
+          <w:color w:val="000000"/>
+          <w:sz w:val="21"/>
+          <w:szCs w:val="21"/>
+        </w:rPr>
+        <w:t xml:space="preserve">8</w:t>
+      </w:r>
+    </w:p>
+    <w:p>
+      <w:pPr>
+        <w:tabs>
+          <w:tab w:val="right" w:pos="9360" w:leader="dot"/>
+        </w:tabs>
+        <w:spacing w:after="20" w:line="300" w:lineRule="exact"/>
+        <w:ind w:left="360"/>
+      </w:pPr>
+      <w:r>
+        <w:rPr>
+          <w:rFonts w:ascii="Cambria" w:cs="Cambria" w:eastAsia="Cambria" w:hAnsi="Cambria"/>
+          <w:b w:val="false"/>
+          <w:bCs w:val="false"/>
+          <w:color w:val="000000"/>
+          <w:sz w:val="21"/>
+          <w:szCs w:val="21"/>
+        </w:rPr>
+        <w:t xml:space="preserve">4.1 Q1 — the naive metric is fooled</w:t>
+      </w:r>
+      <w:r>
+        <w:rPr>
+          <w:rFonts w:ascii="Cambria" w:cs="Cambria" w:eastAsia="Cambria" w:hAnsi="Cambria"/>
+          <w:color w:val="000000"/>
+          <w:sz w:val="21"/>
+          <w:szCs w:val="21"/>
+        </w:rPr>
+        <w:tab/>
+      </w:r>
+      <w:r>
+        <w:rPr>
+          <w:rFonts w:ascii="Cambria" w:cs="Cambria" w:eastAsia="Cambria" w:hAnsi="Cambria"/>
+          <w:b w:val="false"/>
+          <w:bCs w:val="false"/>
+          <w:color w:val="000000"/>
+          <w:sz w:val="21"/>
+          <w:szCs w:val="21"/>
+        </w:rPr>
+        <w:t xml:space="preserve">8</w:t>
+      </w:r>
+    </w:p>
+    <w:p>
+      <w:pPr>
+        <w:tabs>
+          <w:tab w:val="right" w:pos="9360" w:leader="dot"/>
+        </w:tabs>
+        <w:spacing w:after="20" w:line="300" w:lineRule="exact"/>
+        <w:ind w:left="360"/>
+      </w:pPr>
+      <w:r>
+        <w:rPr>
+          <w:rFonts w:ascii="Cambria" w:cs="Cambria" w:eastAsia="Cambria" w:hAnsi="Cambria"/>
+          <w:b w:val="false"/>
+          <w:bCs w:val="false"/>
+          <w:color w:val="000000"/>
+          <w:sz w:val="21"/>
+          <w:szCs w:val="21"/>
+        </w:rPr>
+        <w:t xml:space="preserve">4.2 Q2 — the deflated gate holds at zero</w:t>
+      </w:r>
+      <w:r>
+        <w:rPr>
+          <w:rFonts w:ascii="Cambria" w:cs="Cambria" w:eastAsia="Cambria" w:hAnsi="Cambria"/>
+          <w:color w:val="000000"/>
+          <w:sz w:val="21"/>
+          <w:szCs w:val="21"/>
+        </w:rPr>
+        <w:tab/>
+      </w:r>
+      <w:r>
+        <w:rPr>
+          <w:rFonts w:ascii="Cambria" w:cs="Cambria" w:eastAsia="Cambria" w:hAnsi="Cambria"/>
+          <w:b w:val="false"/>
+          <w:bCs w:val="false"/>
+          <w:color w:val="000000"/>
+          <w:sz w:val="21"/>
+          <w:szCs w:val="21"/>
+        </w:rPr>
+        <w:t xml:space="preserve">8</w:t>
+      </w:r>
+    </w:p>
+    <w:p>
+      <w:pPr>
+        <w:tabs>
+          <w:tab w:val="right" w:pos="9360" w:leader="dot"/>
+        </w:tabs>
+        <w:spacing w:after="20" w:line="300" w:lineRule="exact"/>
+        <w:ind w:left="360"/>
+      </w:pPr>
+      <w:r>
+        <w:rPr>
+          <w:rFonts w:ascii="Cambria" w:cs="Cambria" w:eastAsia="Cambria" w:hAnsi="Cambria"/>
+          <w:b w:val="false"/>
+          <w:bCs w:val="false"/>
+          <w:color w:val="000000"/>
+          <w:sz w:val="21"/>
+          <w:szCs w:val="21"/>
+        </w:rPr>
+        <w:t xml:space="preserve">4.3 Q3 — the ablation and over-deflation check</w:t>
+      </w:r>
+      <w:r>
+        <w:rPr>
+          <w:rFonts w:ascii="Cambria" w:cs="Cambria" w:eastAsia="Cambria" w:hAnsi="Cambria"/>
+          <w:color w:val="000000"/>
+          <w:sz w:val="21"/>
+          <w:szCs w:val="21"/>
+        </w:rPr>
+        <w:tab/>
+      </w:r>
+      <w:r>
+        <w:rPr>
+          <w:rFonts w:ascii="Cambria" w:cs="Cambria" w:eastAsia="Cambria" w:hAnsi="Cambria"/>
+          <w:b w:val="false"/>
+          <w:bCs w:val="false"/>
+          <w:color w:val="000000"/>
+          <w:sz w:val="21"/>
+          <w:szCs w:val="21"/>
+        </w:rPr>
+        <w:t xml:space="preserve">9</w:t>
+      </w:r>
+    </w:p>
+    <w:p>
+      <w:pPr>
+        <w:tabs>
+          <w:tab w:val="right" w:pos="9360" w:leader="dot"/>
+        </w:tabs>
+        <w:spacing w:after="20" w:line="300" w:lineRule="exact"/>
+        <w:ind w:left="360"/>
+      </w:pPr>
+      <w:r>
+        <w:rPr>
+          <w:rFonts w:ascii="Cambria" w:cs="Cambria" w:eastAsia="Cambria" w:hAnsi="Cambria"/>
+          <w:b w:val="false"/>
+          <w:bCs w:val="false"/>
+          <w:color w:val="000000"/>
+          <w:sz w:val="21"/>
+          <w:szCs w:val="21"/>
+        </w:rPr>
+        <w:t xml:space="preserve">4.4 The live-LLM arm (Claude Opus 4.8)</w:t>
+      </w:r>
+      <w:r>
+        <w:rPr>
+          <w:rFonts w:ascii="Cambria" w:cs="Cambria" w:eastAsia="Cambria" w:hAnsi="Cambria"/>
+          <w:color w:val="000000"/>
+          <w:sz w:val="21"/>
+          <w:szCs w:val="21"/>
+        </w:rPr>
+        <w:tab/>
+      </w:r>
+      <w:r>
+        <w:rPr>
+          <w:rFonts w:ascii="Cambria" w:cs="Cambria" w:eastAsia="Cambria" w:hAnsi="Cambria"/>
+          <w:b w:val="false"/>
+          <w:bCs w:val="false"/>
+          <w:color w:val="000000"/>
+          <w:sz w:val="21"/>
+          <w:szCs w:val="21"/>
+        </w:rPr>
+        <w:t xml:space="preserve">10</w:t>
+      </w:r>
+    </w:p>
+    <w:p>
+      <w:pPr>
+        <w:tabs>
+          <w:tab w:val="right" w:pos="9360" w:leader="dot"/>
+        </w:tabs>
+        <w:spacing w:after="20" w:line="300" w:lineRule="exact"/>
+        <w:ind w:left="360"/>
+      </w:pPr>
+      <w:r>
+        <w:rPr>
+          <w:rFonts w:ascii="Cambria" w:cs="Cambria" w:eastAsia="Cambria" w:hAnsi="Cambria"/>
+          <w:b w:val="false"/>
+          <w:bCs w:val="false"/>
+          <w:color w:val="000000"/>
+          <w:sz w:val="21"/>
+          <w:szCs w:val="21"/>
+        </w:rPr>
+        <w:t xml:space="preserve">4.5 The gate's power curve</w:t>
+      </w:r>
+      <w:r>
+        <w:rPr>
+          <w:rFonts w:ascii="Cambria" w:cs="Cambria" w:eastAsia="Cambria" w:hAnsi="Cambria"/>
+          <w:color w:val="000000"/>
+          <w:sz w:val="21"/>
+          <w:szCs w:val="21"/>
+        </w:rPr>
+        <w:tab/>
+      </w:r>
+      <w:r>
+        <w:rPr>
+          <w:rFonts w:ascii="Cambria" w:cs="Cambria" w:eastAsia="Cambria" w:hAnsi="Cambria"/>
+          <w:b w:val="false"/>
+          <w:bCs w:val="false"/>
+          <w:color w:val="000000"/>
+          <w:sz w:val="21"/>
+          <w:szCs w:val="21"/>
+        </w:rPr>
+        <w:t xml:space="preserve">12</w:t>
+      </w:r>
+    </w:p>
+    <w:p>
+      <w:pPr>
+        <w:tabs>
+          <w:tab w:val="right" w:pos="9360" w:leader="dot"/>
+        </w:tabs>
+        <w:spacing w:after="20" w:line="300" w:lineRule="exact"/>
+        <w:ind w:left="360"/>
+      </w:pPr>
+      <w:r>
+        <w:rPr>
+          <w:rFonts w:ascii="Cambria" w:cs="Cambria" w:eastAsia="Cambria" w:hAnsi="Cambria"/>
+          <w:b w:val="false"/>
+          <w:bCs w:val="false"/>
+          <w:color w:val="000000"/>
+          <w:sz w:val="21"/>
+          <w:szCs w:val="21"/>
+        </w:rPr>
+        <w:t xml:space="preserve">4.6 Distribution-free confirmation</w:t>
+      </w:r>
+      <w:r>
+        <w:rPr>
+          <w:rFonts w:ascii="Cambria" w:cs="Cambria" w:eastAsia="Cambria" w:hAnsi="Cambria"/>
+          <w:color w:val="000000"/>
+          <w:sz w:val="21"/>
+          <w:szCs w:val="21"/>
+        </w:rPr>
+        <w:tab/>
+      </w:r>
+      <w:r>
+        <w:rPr>
+          <w:rFonts w:ascii="Cambria" w:cs="Cambria" w:eastAsia="Cambria" w:hAnsi="Cambria"/>
+          <w:b w:val="false"/>
+          <w:bCs w:val="false"/>
+          <w:color w:val="000000"/>
+          <w:sz w:val="21"/>
+          <w:szCs w:val="21"/>
+        </w:rPr>
+        <w:t xml:space="preserve">13</w:t>
+      </w:r>
+    </w:p>
+    <w:p>
+      <w:pPr>
+        <w:tabs>
+          <w:tab w:val="right" w:pos="9360" w:leader="dot"/>
+        </w:tabs>
+        <w:spacing w:after="20" w:line="300" w:lineRule="exact"/>
+        <w:ind w:left="360"/>
+      </w:pPr>
+      <w:r>
+        <w:rPr>
+          <w:rFonts w:ascii="Cambria" w:cs="Cambria" w:eastAsia="Cambria" w:hAnsi="Cambria"/>
+          <w:b w:val="false"/>
+          <w:bCs w:val="false"/>
+          <w:color w:val="000000"/>
+          <w:sz w:val="21"/>
+          <w:szCs w:val="21"/>
+        </w:rPr>
+        <w:t xml:space="preserve">4.7 Generalization 1 — cross-sectional equity panel</w:t>
+      </w:r>
+      <w:r>
+        <w:rPr>
+          <w:rFonts w:ascii="Cambria" w:cs="Cambria" w:eastAsia="Cambria" w:hAnsi="Cambria"/>
+          <w:color w:val="000000"/>
+          <w:sz w:val="21"/>
+          <w:szCs w:val="21"/>
+        </w:rPr>
+        <w:tab/>
+      </w:r>
+      <w:r>
+        <w:rPr>
+          <w:rFonts w:ascii="Cambria" w:cs="Cambria" w:eastAsia="Cambria" w:hAnsi="Cambria"/>
+          <w:b w:val="false"/>
+          <w:bCs w:val="false"/>
+          <w:color w:val="000000"/>
+          <w:sz w:val="21"/>
+          <w:szCs w:val="21"/>
+        </w:rPr>
+        <w:t xml:space="preserve">13</w:t>
+      </w:r>
+    </w:p>
+    <w:p>
+      <w:pPr>
+        <w:tabs>
+          <w:tab w:val="right" w:pos="9360" w:leader="dot"/>
+        </w:tabs>
+        <w:spacing w:after="20" w:line="300" w:lineRule="exact"/>
+        <w:ind w:left="360"/>
+      </w:pPr>
+      <w:r>
+        <w:rPr>
+          <w:rFonts w:ascii="Cambria" w:cs="Cambria" w:eastAsia="Cambria" w:hAnsi="Cambria"/>
+          <w:b w:val="false"/>
+          <w:bCs w:val="false"/>
+          <w:color w:val="000000"/>
+          <w:sz w:val="21"/>
+          <w:szCs w:val="21"/>
+        </w:rPr>
+        <w:t xml:space="preserve">4.8 Generalization 2 — independent real markets</w:t>
+      </w:r>
+      <w:r>
+        <w:rPr>
+          <w:rFonts w:ascii="Cambria" w:cs="Cambria" w:eastAsia="Cambria" w:hAnsi="Cambria"/>
+          <w:color w:val="000000"/>
+          <w:sz w:val="21"/>
+          <w:szCs w:val="21"/>
+        </w:rPr>
+        <w:tab/>
+      </w:r>
+      <w:r>
+        <w:rPr>
+          <w:rFonts w:ascii="Cambria" w:cs="Cambria" w:eastAsia="Cambria" w:hAnsi="Cambria"/>
+          <w:b w:val="false"/>
+          <w:bCs w:val="false"/>
+          <w:color w:val="000000"/>
+          <w:sz w:val="21"/>
+          <w:szCs w:val="21"/>
+        </w:rPr>
+        <w:t xml:space="preserve">14</w:t>
+      </w:r>
+    </w:p>
+    <w:p>
+      <w:pPr>
+        <w:tabs>
+          <w:tab w:val="right" w:pos="9360" w:leader="dot"/>
+        </w:tabs>
+        <w:spacing w:after="20" w:line="300" w:lineRule="exact"/>
+        <w:ind w:left="360"/>
+      </w:pPr>
+      <w:r>
+        <w:rPr>
+          <w:rFonts w:ascii="Cambria" w:cs="Cambria" w:eastAsia="Cambria" w:hAnsi="Cambria"/>
+          <w:b w:val="false"/>
+          <w:bCs w:val="false"/>
+          <w:color w:val="000000"/>
+          <w:sz w:val="21"/>
+          <w:szCs w:val="21"/>
+        </w:rPr>
+        <w:t xml:space="preserve">4.9 The correct multiple-testing bar</w:t>
+      </w:r>
+      <w:r>
+        <w:rPr>
+          <w:rFonts w:ascii="Cambria" w:cs="Cambria" w:eastAsia="Cambria" w:hAnsi="Cambria"/>
+          <w:color w:val="000000"/>
+          <w:sz w:val="21"/>
+          <w:szCs w:val="21"/>
+        </w:rPr>
+        <w:tab/>
+      </w:r>
+      <w:r>
+        <w:rPr>
+          <w:rFonts w:ascii="Cambria" w:cs="Cambria" w:eastAsia="Cambria" w:hAnsi="Cambria"/>
+          <w:b w:val="false"/>
+          <w:bCs w:val="false"/>
+          <w:color w:val="000000"/>
+          <w:sz w:val="21"/>
+          <w:szCs w:val="21"/>
+        </w:rPr>
+        <w:t xml:space="preserve">15</w:t>
+      </w:r>
+    </w:p>
+    <w:p>
+      <w:pPr>
+        <w:tabs>
+          <w:tab w:val="right" w:pos="9360" w:leader="dot"/>
+        </w:tabs>
+        <w:spacing w:after="20" w:line="300" w:lineRule="exact"/>
+      </w:pPr>
+      <w:r>
+        <w:rPr>
+          <w:rFonts w:ascii="Cambria" w:cs="Cambria" w:eastAsia="Cambria" w:hAnsi="Cambria"/>
+          <w:b/>
+          <w:bCs/>
+          <w:color w:val="000000"/>
+          <w:sz w:val="21"/>
+          <w:szCs w:val="21"/>
+        </w:rPr>
+        <w:t xml:space="preserve">5. Related work</w:t>
+      </w:r>
+      <w:r>
+        <w:rPr>
+          <w:rFonts w:ascii="Cambria" w:cs="Cambria" w:eastAsia="Cambria" w:hAnsi="Cambria"/>
+          <w:color w:val="000000"/>
+          <w:sz w:val="21"/>
+          <w:szCs w:val="21"/>
+        </w:rPr>
+        <w:tab/>
+      </w:r>
+      <w:r>
+        <w:rPr>
+          <w:rFonts w:ascii="Cambria" w:cs="Cambria" w:eastAsia="Cambria" w:hAnsi="Cambria"/>
+          <w:b/>
+          <w:bCs/>
+          <w:color w:val="000000"/>
+          <w:sz w:val="21"/>
+          <w:szCs w:val="21"/>
+        </w:rPr>
+        <w:t xml:space="preserve">16</w:t>
+      </w:r>
+    </w:p>
+    <w:p>
+      <w:pPr>
+        <w:tabs>
+          <w:tab w:val="right" w:pos="9360" w:leader="dot"/>
+        </w:tabs>
+        <w:spacing w:after="20" w:line="300" w:lineRule="exact"/>
+      </w:pPr>
+      <w:r>
+        <w:rPr>
+          <w:rFonts w:ascii="Cambria" w:cs="Cambria" w:eastAsia="Cambria" w:hAnsi="Cambria"/>
+          <w:b/>
+          <w:bCs/>
+          <w:color w:val="000000"/>
+          <w:sz w:val="21"/>
+          <w:szCs w:val="21"/>
+        </w:rPr>
+        <w:t xml:space="preserve">6. Limitations</w:t>
+      </w:r>
+      <w:r>
+        <w:rPr>
+          <w:rFonts w:ascii="Cambria" w:cs="Cambria" w:eastAsia="Cambria" w:hAnsi="Cambria"/>
+          <w:color w:val="000000"/>
+          <w:sz w:val="21"/>
+          <w:szCs w:val="21"/>
+        </w:rPr>
+        <w:tab/>
+      </w:r>
+      <w:r>
+        <w:rPr>
+          <w:rFonts w:ascii="Cambria" w:cs="Cambria" w:eastAsia="Cambria" w:hAnsi="Cambria"/>
+          <w:b/>
+          <w:bCs/>
+          <w:color w:val="000000"/>
+          <w:sz w:val="21"/>
+          <w:szCs w:val="21"/>
+        </w:rPr>
+        <w:t xml:space="preserve">18</w:t>
+      </w:r>
+    </w:p>
+    <w:p>
+      <w:pPr>
+        <w:tabs>
+          <w:tab w:val="right" w:pos="9360" w:leader="dot"/>
+        </w:tabs>
+        <w:spacing w:after="20" w:line="300" w:lineRule="exact"/>
+      </w:pPr>
+      <w:r>
+        <w:rPr>
+          <w:rFonts w:ascii="Cambria" w:cs="Cambria" w:eastAsia="Cambria" w:hAnsi="Cambria"/>
+          <w:b/>
+          <w:bCs/>
+          <w:color w:val="000000"/>
+          <w:sz w:val="21"/>
+          <w:szCs w:val="21"/>
+        </w:rPr>
+        <w:t xml:space="preserve">7. Future work</w:t>
+      </w:r>
+      <w:r>
+        <w:rPr>
+          <w:rFonts w:ascii="Cambria" w:cs="Cambria" w:eastAsia="Cambria" w:hAnsi="Cambria"/>
+          <w:color w:val="000000"/>
+          <w:sz w:val="21"/>
+          <w:szCs w:val="21"/>
+        </w:rPr>
+        <w:tab/>
+      </w:r>
+      <w:r>
+        <w:rPr>
+          <w:rFonts w:ascii="Cambria" w:cs="Cambria" w:eastAsia="Cambria" w:hAnsi="Cambria"/>
+          <w:b/>
+          <w:bCs/>
+          <w:color w:val="000000"/>
+          <w:sz w:val="21"/>
+          <w:szCs w:val="21"/>
+        </w:rPr>
+        <w:t xml:space="preserve">19</w:t>
+      </w:r>
+    </w:p>
+    <w:p>
+      <w:pPr>
+        <w:tabs>
+          <w:tab w:val="right" w:pos="9360" w:leader="dot"/>
+        </w:tabs>
+        <w:spacing w:after="20" w:line="300" w:lineRule="exact"/>
+      </w:pPr>
+      <w:r>
+        <w:rPr>
+          <w:rFonts w:ascii="Cambria" w:cs="Cambria" w:eastAsia="Cambria" w:hAnsi="Cambria"/>
+          <w:b/>
+          <w:bCs/>
+          <w:color w:val="000000"/>
+          <w:sz w:val="21"/>
+          <w:szCs w:val="21"/>
+        </w:rPr>
+        <w:t xml:space="preserve">8. Reproducibility</w:t>
+      </w:r>
+      <w:r>
+        <w:rPr>
+          <w:rFonts w:ascii="Cambria" w:cs="Cambria" w:eastAsia="Cambria" w:hAnsi="Cambria"/>
+          <w:color w:val="000000"/>
+          <w:sz w:val="21"/>
+          <w:szCs w:val="21"/>
+        </w:rPr>
+        <w:tab/>
+      </w:r>
+      <w:r>
+        <w:rPr>
+          <w:rFonts w:ascii="Cambria" w:cs="Cambria" w:eastAsia="Cambria" w:hAnsi="Cambria"/>
+          <w:b/>
+          <w:bCs/>
+          <w:color w:val="000000"/>
+          <w:sz w:val="21"/>
+          <w:szCs w:val="21"/>
+        </w:rPr>
+        <w:t xml:space="preserve">20</w:t>
+      </w:r>
+    </w:p>
+    <w:p>
+      <w:pPr>
+        <w:tabs>
+          <w:tab w:val="right" w:pos="9360" w:leader="dot"/>
+        </w:tabs>
+        <w:spacing w:after="20" w:line="300" w:lineRule="exact"/>
+      </w:pPr>
+      <w:r>
+        <w:rPr>
+          <w:rFonts w:ascii="Cambria" w:cs="Cambria" w:eastAsia="Cambria" w:hAnsi="Cambria"/>
+          <w:b/>
+          <w:bCs/>
+          <w:color w:val="000000"/>
+          <w:sz w:val="21"/>
+          <w:szCs w:val="21"/>
+        </w:rPr>
+        <w:t xml:space="preserve">9. Authorship and contributions</w:t>
+      </w:r>
+      <w:r>
+        <w:rPr>
+          <w:rFonts w:ascii="Cambria" w:cs="Cambria" w:eastAsia="Cambria" w:hAnsi="Cambria"/>
+          <w:color w:val="000000"/>
+          <w:sz w:val="21"/>
+          <w:szCs w:val="21"/>
+        </w:rPr>
+        <w:tab/>
+      </w:r>
+      <w:r>
+        <w:rPr>
+          <w:rFonts w:ascii="Cambria" w:cs="Cambria" w:eastAsia="Cambria" w:hAnsi="Cambria"/>
+          <w:b/>
+          <w:bCs/>
+          <w:color w:val="000000"/>
+          <w:sz w:val="21"/>
+          <w:szCs w:val="21"/>
+        </w:rPr>
+        <w:t xml:space="preserve">20</w:t>
+      </w:r>
+    </w:p>
+    <w:p>
+      <w:pPr>
+        <w:tabs>
+          <w:tab w:val="right" w:pos="9360" w:leader="dot"/>
+        </w:tabs>
+        <w:spacing w:after="20" w:line="300" w:lineRule="exact"/>
+      </w:pPr>
+      <w:r>
+        <w:rPr>
+          <w:rFonts w:ascii="Cambria" w:cs="Cambria" w:eastAsia="Cambria" w:hAnsi="Cambria"/>
+          <w:b/>
+          <w:bCs/>
+          <w:color w:val="000000"/>
+          <w:sz w:val="21"/>
+          <w:szCs w:val="21"/>
+        </w:rPr>
+        <w:t xml:space="preserve">10. Reproducibility and disclosure</w:t>
+      </w:r>
+      <w:r>
+        <w:rPr>
+          <w:rFonts w:ascii="Cambria" w:cs="Cambria" w:eastAsia="Cambria" w:hAnsi="Cambria"/>
+          <w:color w:val="000000"/>
+          <w:sz w:val="21"/>
+          <w:szCs w:val="21"/>
+        </w:rPr>
+        <w:tab/>
+      </w:r>
+      <w:r>
+        <w:rPr>
+          <w:rFonts w:ascii="Cambria" w:cs="Cambria" w:eastAsia="Cambria" w:hAnsi="Cambria"/>
+          <w:b/>
+          <w:bCs/>
+          <w:color w:val="000000"/>
+          <w:sz w:val="21"/>
+          <w:szCs w:val="21"/>
+        </w:rPr>
+        <w:t xml:space="preserve">21</w:t>
+      </w:r>
+    </w:p>
+    <w:p>
+      <w:pPr>
+        <w:tabs>
+          <w:tab w:val="right" w:pos="9360" w:leader="dot"/>
+        </w:tabs>
+        <w:spacing w:after="20" w:line="300" w:lineRule="exact"/>
+      </w:pPr>
+      <w:r>
+        <w:rPr>
+          <w:rFonts w:ascii="Cambria" w:cs="Cambria" w:eastAsia="Cambria" w:hAnsi="Cambria"/>
+          <w:b/>
+          <w:bCs/>
+          <w:color w:val="000000"/>
+          <w:sz w:val="21"/>
+          <w:szCs w:val="21"/>
+        </w:rPr>
+        <w:t xml:space="preserve">Acknowledgments</w:t>
+      </w:r>
+      <w:r>
+        <w:rPr>
+          <w:rFonts w:ascii="Cambria" w:cs="Cambria" w:eastAsia="Cambria" w:hAnsi="Cambria"/>
+          <w:color w:val="000000"/>
+          <w:sz w:val="21"/>
+          <w:szCs w:val="21"/>
+        </w:rPr>
+        <w:tab/>
+      </w:r>
+      <w:r>
+        <w:rPr>
+          <w:rFonts w:ascii="Cambria" w:cs="Cambria" w:eastAsia="Cambria" w:hAnsi="Cambria"/>
+          <w:b/>
+          <w:bCs/>
+          <w:color w:val="000000"/>
+          <w:sz w:val="21"/>
+          <w:szCs w:val="21"/>
+        </w:rPr>
+        <w:t xml:space="preserve">21</w:t>
+      </w:r>
+    </w:p>
+    <w:p>
+      <w:pPr>
+        <w:tabs>
+          <w:tab w:val="right" w:pos="9360" w:leader="dot"/>
+        </w:tabs>
+        <w:spacing w:after="20" w:line="300" w:lineRule="exact"/>
+      </w:pPr>
+      <w:r>
+        <w:rPr>
+          <w:rFonts w:ascii="Cambria" w:cs="Cambria" w:eastAsia="Cambria" w:hAnsi="Cambria"/>
+          <w:b/>
+          <w:bCs/>
+          <w:color w:val="000000"/>
+          <w:sz w:val="21"/>
+          <w:szCs w:val="21"/>
+        </w:rPr>
+        <w:t xml:space="preserve">References</w:t>
+      </w:r>
+      <w:r>
+        <w:rPr>
+          <w:rFonts w:ascii="Cambria" w:cs="Cambria" w:eastAsia="Cambria" w:hAnsi="Cambria"/>
+          <w:color w:val="000000"/>
+          <w:sz w:val="21"/>
+          <w:szCs w:val="21"/>
+        </w:rPr>
+        <w:tab/>
+      </w:r>
+      <w:r>
+        <w:rPr>
+          <w:rFonts w:ascii="Cambria" w:cs="Cambria" w:eastAsia="Cambria" w:hAnsi="Cambria"/>
+          <w:b/>
+          <w:bCs/>
+          <w:color w:val="000000"/>
+          <w:sz w:val="21"/>
+          <w:szCs w:val="21"/>
+        </w:rPr>
+        <w:t xml:space="preserve">21</w:t>
+      </w:r>
+    </w:p>
+    <w:p>
+      <w:pPr>
+        <w:tabs>
+          <w:tab w:val="right" w:pos="9360" w:leader="dot"/>
+        </w:tabs>
+        <w:spacing w:after="20" w:line="300" w:lineRule="exact"/>
+      </w:pPr>
+      <w:r>
+        <w:rPr>
+          <w:rFonts w:ascii="Cambria" w:cs="Cambria" w:eastAsia="Cambria" w:hAnsi="Cambria"/>
+          <w:b/>
+          <w:bCs/>
+          <w:color w:val="000000"/>
+          <w:sz w:val="21"/>
+          <w:szCs w:val="21"/>
+        </w:rPr>
+        <w:t xml:space="preserve">Appendix A — key numbers at a glance</w:t>
+      </w:r>
+      <w:r>
+        <w:rPr>
+          <w:rFonts w:ascii="Cambria" w:cs="Cambria" w:eastAsia="Cambria" w:hAnsi="Cambria"/>
+          <w:color w:val="000000"/>
+          <w:sz w:val="21"/>
+          <w:szCs w:val="21"/>
+        </w:rPr>
+        <w:tab/>
+      </w:r>
+      <w:r>
+        <w:rPr>
+          <w:rFonts w:ascii="Cambria" w:cs="Cambria" w:eastAsia="Cambria" w:hAnsi="Cambria"/>
+          <w:b/>
+          <w:bCs/>
+          <w:color w:val="000000"/>
+          <w:sz w:val="21"/>
+          <w:szCs w:val="21"/>
+        </w:rPr>
+        <w:t xml:space="preserve">23</w:t>
+      </w:r>
+    </w:p>
+    <w:p>
+      <w:pPr>
+        <w:pageBreakBefore/>
         <w:spacing w:after="160" w:line="276" w:lineRule="auto"/>
         <w:jc w:val="both"/>
       </w:pPr>

</xml_diff>